<commit_message>
Link the submission documents to the source repository
Every deliverable now carries the repository as a live link: the report's title
block and conclusion, the deck's closing slide, the LaTeX source, README and
SUBMISSION.md. Real link annotations in all four output formats, not printed
text - a PDF hyperlink annotation, a Word w:hyperlink relationship (python-docx
has no API for one, so it is built from the XML), and a pptx run hyperlink.

The URL lives in bodhi/config.REPO_URL so the five builders cannot drift, and it
is the only external URL any document contains.

121 tests pass.

Co-Authored-By: Claude Opus 5 <noreply@anthropic.com>
Claude-Session: https://claude.ai/code/session_01A8GYsYd9keWSy4bnr49ouz
</commit_message>
<xml_diff>
--- a/docs/report/BODHI_Mule_Hunter_Prototype_Report.docx
+++ b/docs/report/BODHI_Mule_Hunter_Prototype_Report.docx
@@ -200,7 +200,6 @@
     </w:p>
     <w:p>
       <w:pPr>
-        <w:spacing w:after="240"/>
         <w:jc w:val="center"/>
       </w:pPr>
       <w:r>
@@ -211,6 +210,31 @@
         </w:rPr>
         <w:t>In association with Bank of India and IIT Hyderabad</w:t>
       </w:r>
+    </w:p>
+    <w:p>
+      <w:pPr>
+        <w:spacing w:after="240"/>
+        <w:jc w:val="center"/>
+      </w:pPr>
+      <w:r>
+        <w:rPr>
+          <w:rFonts w:ascii="Consolas" w:hAnsi="Consolas"/>
+          <w:b w:val="0"/>
+          <w:i w:val="0"/>
+          <w:sz w:val="18"/>
+        </w:rPr>
+        <w:t xml:space="preserve">Source code: </w:t>
+      </w:r>
+      <w:hyperlink r:id="rId9">
+        <w:r>
+          <w:rPr>
+            <w:color w:val="0563C1"/>
+            <w:u w:val="single"/>
+            <w:sz w:val="18"/>
+          </w:rPr>
+          <w:t>github.com/archirajpoot/Bodhi_Mule_Hunter</w:t>
+        </w:r>
+      </w:hyperlink>
     </w:p>
     <w:p>
       <w:pPr>
@@ -1848,7 +1872,7 @@
                     <pic:cNvPicPr/>
                   </pic:nvPicPr>
                   <pic:blipFill>
-                    <a:blip r:embed="rId9"/>
+                    <a:blip r:embed="rId10"/>
                     <a:stretch>
                       <a:fillRect/>
                     </a:stretch>
@@ -1900,7 +1924,7 @@
                     <pic:cNvPicPr/>
                   </pic:nvPicPr>
                   <pic:blipFill>
-                    <a:blip r:embed="rId10"/>
+                    <a:blip r:embed="rId11"/>
                     <a:stretch>
                       <a:fillRect/>
                     </a:stretch>
@@ -1952,7 +1976,7 @@
                     <pic:cNvPicPr/>
                   </pic:nvPicPr>
                   <pic:blipFill>
-                    <a:blip r:embed="rId11"/>
+                    <a:blip r:embed="rId12"/>
                     <a:stretch>
                       <a:fillRect/>
                     </a:stretch>
@@ -2502,7 +2526,19 @@
           <w:b w:val="0"/>
           <w:i w:val="0"/>
         </w:rPr>
-        <w:t>Mule detection fails today not because the signal is absent but because single-account rule engines cannot express it. Giving the problem three complementary views — behavioural aggregates, network structure and event ordering — and fusing them under a monotonicity constraint into a calibrated score reduces false positives by 99.99% at unchanged recall relative to a realistic incumbent, while producing explanations specific enough to file and containment actions cautious enough to automate. The same discipline is applied to the organisers' own alert schema, where the honest finding is that four of its columns encode the answer and the bank's eighteen expert-chosen features beat automatic selection over several thousand. The complete system, the data simulator and every script needed to reproduce these numbers are released alongside this report.</w:t>
+        <w:t xml:space="preserve">Mule detection fails today not because the signal is absent but because single-account rule engines cannot express it. Giving the problem three complementary views — behavioural aggregates, network structure and event ordering — and fusing them under a monotonicity constraint into a calibrated score reduces false positives by 99.99% at unchanged recall relative to a realistic incumbent, while producing explanations specific enough to file and containment actions cautious enough to automate. The same discipline is applied to the organisers' own alert schema, where the honest finding is that four of its columns encode the answer and the bank's eighteen expert-chosen features beat automatic selection over several thousand. The complete system, the data simulator and every script needed to reproduce these numbers are released at </w:t>
+      </w:r>
+      <w:hyperlink r:id="rId9">
+        <w:r>
+          <w:rPr>
+            <w:color w:val="0563C1"/>
+            <w:u w:val="single"/>
+          </w:rPr>
+          <w:t>github.com/archirajpoot/Bodhi_Mule_Hunter</w:t>
+        </w:r>
+      </w:hyperlink>
+      <w:r>
+        <w:t>.</w:t>
       </w:r>
     </w:p>
     <w:p>

</xml_diff>

<commit_message>
Put the repository link on every page and every slide
It was only on the title block and the conclusion, so a reviewer reading page
four had nothing to click.

Report PDF: a running footer with the link and "n / total" drawn onto each page
after rendering. Chromium implements no `position: running()`, so a print-CSS
footer is not available; the text is placed inside the existing 18 mm bottom
margin with a link annotation over the URL glyphs.

Report DOCX: a real Word footer on both sections - Word does not inherit a
footer across a section break, so each one gets its own.

Deck PPTX and PDF: the link joins the running footer on all 18 numbered slides
and is added to the title slide, which has no footer.

Verified by reading the annotations back: 7/7 report pages, 19/19 slides in both
deck formats. 121 tests pass.

Co-Authored-By: Claude Opus 5 <noreply@anthropic.com>
Claude-Session: https://claude.ai/code/session_01A8GYsYd9keWSy4bnr49ouz
</commit_message>
<xml_diff>
--- a/docs/report/BODHI_Mule_Hunter_Prototype_Report.docx
+++ b/docs/report/BODHI_Mule_Hunter_Prototype_Report.docx
@@ -239,6 +239,7 @@
     <w:p>
       <w:pPr>
         <w:sectPr>
+          <w:footerReference w:type="default" r:id="rId13"/>
           <w:pgSz w:w="12240" w:h="15840"/>
           <w:pgMar w:top="1080" w:right="893" w:bottom="1440" w:left="893" w:header="720" w:footer="720" w:gutter="0"/>
           <w:cols w:space="720"/>
@@ -2649,6 +2650,7 @@
       </w:r>
     </w:p>
     <w:sectPr>
+      <w:footerReference w:type="default" r:id="rId14"/>
       <w:type w:val="continuous"/>
       <w:pgSz w:w="12240" w:h="15840"/>
       <w:pgMar w:top="1080" w:right="893" w:bottom="1440" w:left="893" w:header="720" w:footer="720" w:gutter="0"/>
@@ -2657,6 +2659,62 @@
     </w:sectPr>
   </w:body>
 </w:document>
+</file>
+
+<file path=word/footer1.xml><?xml version="1.0" encoding="utf-8"?>
+<w:ftr xmlns:m="http://schemas.openxmlformats.org/officeDocument/2006/math" xmlns:mc="http://schemas.openxmlformats.org/markup-compatibility/2006" xmlns:mo="http://schemas.microsoft.com/office/mac/office/2008/main" xmlns:mv="urn:schemas-microsoft-com:mac:vml" xmlns:o="urn:schemas-microsoft-com:office:office" xmlns:r="http://schemas.openxmlformats.org/officeDocument/2006/relationships" xmlns:v="urn:schemas-microsoft-com:vml" xmlns:w10="urn:schemas-microsoft-com:office:word" xmlns:w14="http://schemas.microsoft.com/office/word/2010/wordml" xmlns:w="http://schemas.openxmlformats.org/wordprocessingml/2006/main" xmlns:wne="http://schemas.microsoft.com/office/word/2006/wordml" xmlns:wp14="http://schemas.microsoft.com/office/word/2010/wordprocessingDrawing" xmlns:wp="http://schemas.openxmlformats.org/drawingml/2006/wordprocessingDrawing" xmlns:wpc="http://schemas.microsoft.com/office/word/2010/wordprocessingCanvas" xmlns:wpg="http://schemas.microsoft.com/office/word/2010/wordprocessingGroup" xmlns:wpi="http://schemas.microsoft.com/office/word/2010/wordprocessingInk" xmlns:wps="http://schemas.microsoft.com/office/word/2010/wordprocessingShape" mc:Ignorable="w14 wp14">
+  <w:p>
+    <w:pPr>
+      <w:pStyle w:val="Footer"/>
+      <w:jc w:val="center"/>
+    </w:pPr>
+    <w:r>
+      <w:rPr>
+        <w:rFonts w:ascii="Times New Roman" w:hAnsi="Times New Roman"/>
+        <w:sz w:val="16"/>
+      </w:rPr>
+      <w:t xml:space="preserve">Source code: </w:t>
+    </w:r>
+    <w:hyperlink r:id="rId1">
+      <w:r>
+        <w:rPr>
+          <w:color w:val="0563C1"/>
+          <w:u w:val="single"/>
+          <w:sz w:val="16"/>
+        </w:rPr>
+        <w:t>github.com/archirajpoot/Bodhi_Mule_Hunter</w:t>
+      </w:r>
+    </w:hyperlink>
+  </w:p>
+</w:ftr>
+</file>
+
+<file path=word/footer2.xml><?xml version="1.0" encoding="utf-8"?>
+<w:ftr xmlns:m="http://schemas.openxmlformats.org/officeDocument/2006/math" xmlns:mc="http://schemas.openxmlformats.org/markup-compatibility/2006" xmlns:mo="http://schemas.microsoft.com/office/mac/office/2008/main" xmlns:mv="urn:schemas-microsoft-com:mac:vml" xmlns:o="urn:schemas-microsoft-com:office:office" xmlns:r="http://schemas.openxmlformats.org/officeDocument/2006/relationships" xmlns:v="urn:schemas-microsoft-com:vml" xmlns:w10="urn:schemas-microsoft-com:office:word" xmlns:w14="http://schemas.microsoft.com/office/word/2010/wordml" xmlns:w="http://schemas.openxmlformats.org/wordprocessingml/2006/main" xmlns:wne="http://schemas.microsoft.com/office/word/2006/wordml" xmlns:wp14="http://schemas.microsoft.com/office/word/2010/wordprocessingDrawing" xmlns:wp="http://schemas.openxmlformats.org/drawingml/2006/wordprocessingDrawing" xmlns:wpc="http://schemas.microsoft.com/office/word/2010/wordprocessingCanvas" xmlns:wpg="http://schemas.microsoft.com/office/word/2010/wordprocessingGroup" xmlns:wpi="http://schemas.microsoft.com/office/word/2010/wordprocessingInk" xmlns:wps="http://schemas.microsoft.com/office/word/2010/wordprocessingShape" mc:Ignorable="w14 wp14">
+  <w:p>
+    <w:pPr>
+      <w:pStyle w:val="Footer"/>
+      <w:jc w:val="center"/>
+    </w:pPr>
+    <w:r>
+      <w:rPr>
+        <w:rFonts w:ascii="Times New Roman" w:hAnsi="Times New Roman"/>
+        <w:sz w:val="16"/>
+      </w:rPr>
+      <w:t xml:space="preserve">Source code: </w:t>
+    </w:r>
+    <w:hyperlink r:id="rId1">
+      <w:r>
+        <w:rPr>
+          <w:color w:val="0563C1"/>
+          <w:u w:val="single"/>
+          <w:sz w:val="16"/>
+        </w:rPr>
+        <w:t>github.com/archirajpoot/Bodhi_Mule_Hunter</w:t>
+      </w:r>
+    </w:hyperlink>
+  </w:p>
+</w:ftr>
 </file>
 
 <file path=word/numbering.xml><?xml version="1.0" encoding="utf-8"?>

</xml_diff>